<commit_message>
docs: align thesis formatting strictly with university template
- Added proper front matter order: Dedications, Acknowledgement, TOC, List of Tables, List of Figures, Abstract
- Added real auto Table of Contents field (TOC \o '1-3' \h \z \u)
- Added dedicated Chapter Cover Pages for all 8 chapters (e.g. 'Chapter 1' and 'Introduction' centered on their own page before the actual content begins)
- Maintained Roman numeral pagination for front matter and Arabic numerals starting from Chapter 1
</commit_message>
<xml_diff>
--- a/docs/FINAL_THESIS_COMPLETE.docx
+++ b/docs/FINAL_THESIS_COMPLETE.docx
@@ -366,7 +366,7 @@
         <w:jc w:val="center"/>
       </w:pPr>
       <w:r>
-        <w:t>DEDICATION</w:t>
+        <w:t>Dedications</w:t>
       </w:r>
     </w:p>
     <w:p/>
@@ -392,7 +392,7 @@
         <w:jc w:val="center"/>
       </w:pPr>
       <w:r>
-        <w:t>ACKNOWLEDGEMENTS</w:t>
+        <w:t>Acknowledgement</w:t>
       </w:r>
     </w:p>
     <w:p/>
@@ -424,6 +424,39 @@
       <w:pPr/>
       <w:r>
         <w:t>Finally, I acknowledge the open-source community — the Flutter team, Firebase team, and countless contributors whose tools and frameworks made this project technically possible.</w:t>
+      </w:r>
+    </w:p>
+    <w:p>
+      <w:r>
+        <w:br w:type="page"/>
+      </w:r>
+    </w:p>
+    <w:p>
+      <w:pPr>
+        <w:jc w:val="center"/>
+      </w:pPr>
+      <w:r>
+        <w:rPr>
+          <w:rFonts w:ascii="Times New Roman" w:hAnsi="Times New Roman"/>
+          <w:b/>
+          <w:sz w:val="32"/>
+        </w:rPr>
+        <w:t>Table of Contents</w:t>
+      </w:r>
+    </w:p>
+    <w:p/>
+    <w:p>
+      <w:r>
+        <w:fldChar w:fldCharType="begin"/>
+        <w:instrText xml:space="preserve"> TOC \o "1-3" \h \z \u </w:instrText>
+        <w:fldChar w:fldCharType="separate"/>
+        <w:fldChar w:fldCharType="end"/>
+      </w:r>
+    </w:p>
+    <w:p>
+      <w:pPr/>
+      <w:r>
+        <w:t>[Right-click here in Word → Update Field → Update Entire Table]</w:t>
       </w:r>
     </w:p>
     <w:p>
@@ -437,7 +470,151 @@
         <w:jc w:val="center"/>
       </w:pPr>
       <w:r>
-        <w:t>ABSTRACT</w:t>
+        <w:t>List of Tables</w:t>
+      </w:r>
+    </w:p>
+    <w:p/>
+    <w:p>
+      <w:pPr/>
+      <w:r>
+        <w:t>Table 2.1 Comparative Analysis of Existing NGO Platforms</w:t>
+      </w:r>
+    </w:p>
+    <w:p>
+      <w:r>
+        <w:br w:type="page"/>
+      </w:r>
+    </w:p>
+    <w:p>
+      <w:pPr>
+        <w:pStyle w:val="Heading1"/>
+        <w:jc w:val="center"/>
+      </w:pPr>
+      <w:r>
+        <w:t>List of Figures</w:t>
+      </w:r>
+    </w:p>
+    <w:p/>
+    <w:p>
+      <w:pPr/>
+      <w:r>
+        <w:t>Figure 4.1 Unified System Architecture</w:t>
+      </w:r>
+    </w:p>
+    <w:p>
+      <w:pPr/>
+      <w:r>
+        <w:t>Figure 4.2 Use Case Diagram</w:t>
+      </w:r>
+    </w:p>
+    <w:p>
+      <w:pPr/>
+      <w:r>
+        <w:t>Figure 4.3 Entity Relationship Diagram</w:t>
+      </w:r>
+    </w:p>
+    <w:p>
+      <w:pPr/>
+      <w:r>
+        <w:t>Figure 4.4 Sequence Diagram — Donation Flow</w:t>
+      </w:r>
+    </w:p>
+    <w:p>
+      <w:pPr/>
+      <w:r>
+        <w:t>Figure 4.5 Sequence Diagram — Volunteer Flow</w:t>
+      </w:r>
+    </w:p>
+    <w:p>
+      <w:pPr/>
+      <w:r>
+        <w:t>Figure 4.6 Activity Diagram — Campaign Lifecycle</w:t>
+      </w:r>
+    </w:p>
+    <w:p>
+      <w:pPr/>
+      <w:r>
+        <w:t>Figure 4.7 Class Diagram</w:t>
+      </w:r>
+    </w:p>
+    <w:p>
+      <w:pPr/>
+      <w:r>
+        <w:t>Figure 4.8 DFD Level 0</w:t>
+      </w:r>
+    </w:p>
+    <w:p>
+      <w:pPr/>
+      <w:r>
+        <w:t>Figure 4.9 DFD Level 1</w:t>
+      </w:r>
+    </w:p>
+    <w:p>
+      <w:pPr/>
+      <w:r>
+        <w:t>Figure 4.10 DFD Level 2</w:t>
+      </w:r>
+    </w:p>
+    <w:p>
+      <w:pPr/>
+      <w:r>
+        <w:t>Figure 4.11 Deployment Diagram</w:t>
+      </w:r>
+    </w:p>
+    <w:p>
+      <w:pPr/>
+      <w:r>
+        <w:t>Figure 4.12 Component Diagram</w:t>
+      </w:r>
+    </w:p>
+    <w:p>
+      <w:pPr/>
+      <w:r>
+        <w:t>Figure 4.13 RBAC Diagram</w:t>
+      </w:r>
+    </w:p>
+    <w:p>
+      <w:pPr/>
+      <w:r>
+        <w:t>Figure 3.1 System Flowchart</w:t>
+      </w:r>
+    </w:p>
+    <w:p>
+      <w:pPr/>
+      <w:r>
+        <w:t>Figure 3.2 Gantt Chart</w:t>
+      </w:r>
+    </w:p>
+    <w:p>
+      <w:pPr/>
+      <w:r>
+        <w:t>Figure 3.3 Work Breakdown Structure</w:t>
+      </w:r>
+    </w:p>
+    <w:p>
+      <w:pPr/>
+      <w:r>
+        <w:t>Figure 3.4 Donation Flowchart</w:t>
+      </w:r>
+    </w:p>
+    <w:p>
+      <w:pPr/>
+      <w:r>
+        <w:t>Figure 3.5 SDLC Model</w:t>
+      </w:r>
+    </w:p>
+    <w:p>
+      <w:r>
+        <w:br w:type="page"/>
+      </w:r>
+    </w:p>
+    <w:p>
+      <w:pPr>
+        <w:pStyle w:val="Heading1"/>
+        <w:jc w:val="center"/>
+      </w:pPr>
+      <w:r>
+        <w:t>Abstract</w:t>
       </w:r>
     </w:p>
     <w:p/>
@@ -478,21 +655,6 @@
     <w:p>
       <w:r>
         <w:br w:type="page"/>
-      </w:r>
-    </w:p>
-    <w:p>
-      <w:pPr>
-        <w:pStyle w:val="Heading1"/>
-        <w:jc w:val="center"/>
-      </w:pPr>
-      <w:r>
-        <w:t>TABLE OF CONTENTS</w:t>
-      </w:r>
-    </w:p>
-    <w:p>
-      <w:pPr/>
-      <w:r>
-        <w:t>[Generate automatically in Word: References → Table of Contents → Automatic Table 1]</w:t>
       </w:r>
     </w:p>
     <w:p>
@@ -507,13 +669,416 @@
         </w:sectPr>
       </w:pPr>
     </w:p>
+    <w:p/>
+    <w:p/>
+    <w:p/>
+    <w:p/>
+    <w:p/>
+    <w:p/>
+    <w:p>
+      <w:pPr>
+        <w:jc w:val="center"/>
+      </w:pPr>
+      <w:r>
+        <w:rPr>
+          <w:rFonts w:ascii="Times New Roman" w:hAnsi="Times New Roman"/>
+          <w:b/>
+          <w:sz w:val="44"/>
+        </w:rPr>
+        <w:t>Chapter 1</w:t>
+      </w:r>
+    </w:p>
+    <w:p>
+      <w:pPr>
+        <w:jc w:val="center"/>
+      </w:pPr>
+      <w:r>
+        <w:rPr>
+          <w:rFonts w:ascii="Times New Roman" w:hAnsi="Times New Roman"/>
+          <w:b/>
+          <w:sz w:val="40"/>
+        </w:rPr>
+        <w:t>Introduction</w:t>
+      </w:r>
+    </w:p>
+    <w:p>
+      <w:r>
+        <w:br w:type="page"/>
+      </w:r>
+    </w:p>
     <w:p>
       <w:pPr>
         <w:pStyle w:val="Heading1"/>
         <w:jc w:val="center"/>
       </w:pPr>
       <w:r>
-        <w:t>CHAPTER 1</w:t>
+        <w:t>Chapter 1: Introduction</w:t>
+      </w:r>
+    </w:p>
+    <w:p>
+      <w:pPr>
+        <w:pStyle w:val="Heading2"/>
+      </w:pPr>
+      <w:r>
+        <w:t>1.1 Background and Context</w:t>
+      </w:r>
+    </w:p>
+    <w:p>
+      <w:pPr/>
+      <w:r>
+        <w:t>Non-Governmental Organizations (NGOs) play a critical role in addressing social challenges in developing countries, particularly in Pakistan, where millions of families depend on charitable assistance for basic needs such as food, healthcare, and education. According to the Pakistan Centre for Philanthropy, Pakistan's individual giving exceeds PKR 300 billion annually [3], yet the majority of NGO operations remain dependent on informal coordination methods including WhatsApp groups, paper-based registers, and manual record-keeping.</w:t>
+      </w:r>
+    </w:p>
+    <w:p>
+      <w:pPr/>
+      <w:r>
+        <w:t>HRAS (Hamesha Rahein Apke Saath), meaning "Always With You," is a registered NGO operating in Pakistan that conducts campaigns across multiple categories including ration distribution, winter drives, medical aid, education support, orphanage visits, and marriage support. Despite its active community presence, HRAS faces operational challenges common to small and medium-sized NGOs: lack of structured donor tracking, inefficient volunteer coordination, absence of real-time campaign analytics, and limited transparency in fund utilization.</w:t>
+      </w:r>
+    </w:p>
+    <w:p>
+      <w:pPr>
+        <w:pStyle w:val="Heading2"/>
+      </w:pPr>
+      <w:r>
+        <w:t>1.2 Problem Domain</w:t>
+      </w:r>
+    </w:p>
+    <w:p>
+      <w:pPr/>
+      <w:r>
+        <w:t>The problem domain encompasses three interconnected areas of NGO operations:</w:t>
+      </w:r>
+    </w:p>
+    <w:p>
+      <w:pPr/>
+      <w:r>
+        <w:t>Donation Management: Most NGOs in Pakistan lack systematic tracking of monetary and in-kind donations. Donors have no visibility into how their contributions are utilized, which reduces trust and repeat giving [10].</w:t>
+      </w:r>
+    </w:p>
+    <w:p>
+      <w:pPr/>
+      <w:r>
+        <w:t>Volunteer Coordination: Volunteer recruitment and management is typically handled through social media and word-of-mouth. There is no structured mechanism for volunteers to discover campaigns or track their contributions [9].</w:t>
+      </w:r>
+    </w:p>
+    <w:p>
+      <w:pPr/>
+      <w:r>
+        <w:t>Campaign Operations: Campaign planning, execution, and impact measurement are conducted through disconnected tools, making it difficult to assess campaign effectiveness or demonstrate impact to stakeholders.</w:t>
+      </w:r>
+    </w:p>
+    <w:p>
+      <w:pPr>
+        <w:pStyle w:val="Heading2"/>
+      </w:pPr>
+      <w:r>
+        <w:t>1.3 Motivation</w:t>
+      </w:r>
+    </w:p>
+    <w:p>
+      <w:pPr/>
+      <w:r>
+        <w:t>The motivation for this project stems from direct engagement with the HRAS NGO leadership and volunteers, who articulated specific operational pain points including inability to generate accurate donation reports, difficulty in tracking volunteer participation, no centralized campaign management system, lack of transparency, and time-consuming manual processes that divert attention from humanitarian work.</w:t>
+      </w:r>
+    </w:p>
+    <w:p>
+      <w:pPr>
+        <w:pStyle w:val="Heading2"/>
+      </w:pPr>
+      <w:r>
+        <w:t>1.4 Problem Statement</w:t>
+      </w:r>
+    </w:p>
+    <w:p>
+      <w:pPr/>
+      <w:r>
+        <w:t>Small and medium-sized NGOs in Pakistan lack an integrated, affordable digital platform that unifies campaign management, donation tracking, volunteer coordination, and impact analytics across mobile and web platforms, resulting in operational inefficiency, reduced donor trust, and limited scalability of humanitarian impact.</w:t>
+      </w:r>
+    </w:p>
+    <w:p>
+      <w:pPr>
+        <w:pStyle w:val="Heading2"/>
+      </w:pPr>
+      <w:r>
+        <w:t>1.5 Project Objectives</w:t>
+      </w:r>
+    </w:p>
+    <w:p>
+      <w:pPr/>
+      <w:r>
+        <w:t>1. To design and develop a cross-platform NGO management ecosystem using Flutter and Firebase that operates on Android, iOS, and Web from a single codebase.</w:t>
+      </w:r>
+    </w:p>
+    <w:p>
+      <w:pPr/>
+      <w:r>
+        <w:t>2. To implement a comprehensive campaign management module supporting the full lifecycle from creation to completion with real-time status tracking.</w:t>
+      </w:r>
+    </w:p>
+    <w:p>
+      <w:pPr/>
+      <w:r>
+        <w:t>3. To build a donation tracking system that records monetary and in-kind contributions with PDF receipt generation for transparency.</w:t>
+      </w:r>
+    </w:p>
+    <w:p>
+      <w:pPr/>
+      <w:r>
+        <w:t>4. To develop a volunteer management module enabling self-registration, campaign participation tracking, and contribution history.</w:t>
+      </w:r>
+    </w:p>
+    <w:p>
+      <w:pPr/>
+      <w:r>
+        <w:t>5. To implement role-based access control (RBAC) ensuring administrative functions are secured through server-side security rules.</w:t>
+      </w:r>
+    </w:p>
+    <w:p>
+      <w:pPr/>
+      <w:r>
+        <w:t>6. To create a responsive admin dashboard providing real-time analytics, user management, and PDF report generation.</w:t>
+      </w:r>
+    </w:p>
+    <w:p>
+      <w:pPr/>
+      <w:r>
+        <w:t>7. To design and implement a unified design system ensuring visual consistency across all platforms.</w:t>
+      </w:r>
+    </w:p>
+    <w:p>
+      <w:pPr/>
+      <w:r>
+        <w:t>8. To evaluate the system through unit testing, user feedback, and comparative analysis with existing solutions.</w:t>
+      </w:r>
+    </w:p>
+    <w:p>
+      <w:pPr>
+        <w:pStyle w:val="Heading2"/>
+      </w:pPr>
+      <w:r>
+        <w:t>1.6 Scope of the Project</w:t>
+      </w:r>
+    </w:p>
+    <w:p>
+      <w:pPr>
+        <w:pStyle w:val="Heading3"/>
+      </w:pPr>
+      <w:r>
+        <w:t>1.6.1 In Scope</w:t>
+      </w:r>
+    </w:p>
+    <w:p>
+      <w:pPr/>
+      <w:r>
+        <w:t>• Mobile application for Android and iOS platforms</w:t>
+      </w:r>
+    </w:p>
+    <w:p>
+      <w:pPr/>
+      <w:r>
+        <w:t>• Web platform with public landing page and authenticated dashboard</w:t>
+      </w:r>
+    </w:p>
+    <w:p>
+      <w:pPr/>
+      <w:r>
+        <w:t>• Admin dashboard with campaign, donation, volunteer, and user management</w:t>
+      </w:r>
+    </w:p>
+    <w:p>
+      <w:pPr/>
+      <w:r>
+        <w:t>• Firebase backend with Firestore, Authentication, and Storage</w:t>
+      </w:r>
+    </w:p>
+    <w:p>
+      <w:pPr/>
+      <w:r>
+        <w:t>• Role-based access control (Admin and Volunteer roles)</w:t>
+      </w:r>
+    </w:p>
+    <w:p>
+      <w:pPr/>
+      <w:r>
+        <w:t>• Real-time data synchronization across platforms</w:t>
+      </w:r>
+    </w:p>
+    <w:p>
+      <w:pPr/>
+      <w:r>
+        <w:t>• PDF generation for donation receipts and analytics reports</w:t>
+      </w:r>
+    </w:p>
+    <w:p>
+      <w:pPr/>
+      <w:r>
+        <w:t>• Dark and light theme support with responsive design</w:t>
+      </w:r>
+    </w:p>
+    <w:p>
+      <w:pPr>
+        <w:pStyle w:val="Heading3"/>
+      </w:pPr>
+      <w:r>
+        <w:t>1.6.2 Out of Scope</w:t>
+      </w:r>
+    </w:p>
+    <w:p>
+      <w:pPr/>
+      <w:r>
+        <w:t>• Online payment gateway integration (JazzCash, Easypaisa)</w:t>
+      </w:r>
+    </w:p>
+    <w:p>
+      <w:pPr/>
+      <w:r>
+        <w:t>• SMS-based notifications</w:t>
+      </w:r>
+    </w:p>
+    <w:p>
+      <w:pPr/>
+      <w:r>
+        <w:t>• Multi-organization (SaaS) support</w:t>
+      </w:r>
+    </w:p>
+    <w:p>
+      <w:pPr/>
+      <w:r>
+        <w:t>• Blockchain-based donation verification</w:t>
+      </w:r>
+    </w:p>
+    <w:p>
+      <w:pPr>
+        <w:pStyle w:val="Heading2"/>
+      </w:pPr>
+      <w:r>
+        <w:t>1.7 Limitations</w:t>
+      </w:r>
+    </w:p>
+    <w:p>
+      <w:pPr/>
+      <w:r>
+        <w:t>1. The system requires internet connectivity for full functionality.</w:t>
+      </w:r>
+    </w:p>
+    <w:p>
+      <w:pPr/>
+      <w:r>
+        <w:t>2. The application does not process real financial transactions; donation recording is manual entry by administrators.</w:t>
+      </w:r>
+    </w:p>
+    <w:p>
+      <w:pPr/>
+      <w:r>
+        <w:t>3. The system is designed for a single organization (HRAS); multi-tenant architecture is not implemented.</w:t>
+      </w:r>
+    </w:p>
+    <w:p>
+      <w:pPr/>
+      <w:r>
+        <w:t>4. Performance testing is limited to emulator and development environments.</w:t>
+      </w:r>
+    </w:p>
+    <w:p>
+      <w:pPr/>
+      <w:r>
+        <w:t>5. Real-time push notifications are not yet implemented; they are planned for FYP-02 using Firebase Cloud Messaging (FCM).</w:t>
+      </w:r>
+    </w:p>
+    <w:p>
+      <w:pPr/>
+      <w:r>
+        <w:t>6. The current system does not include an intelligent volunteer-campaign matching algorithm; this is planned as an innovation feature for FYP-02.</w:t>
+      </w:r>
+    </w:p>
+    <w:p>
+      <w:pPr/>
+      <w:r>
+        <w:t>7. Comprehensive user acceptance testing (UAT) with real HRAS volunteers has not yet been conducted; a formal user study is planned for FYP-02.</w:t>
+      </w:r>
+    </w:p>
+    <w:p>
+      <w:pPr>
+        <w:pStyle w:val="Heading2"/>
+      </w:pPr>
+      <w:r>
+        <w:t>1.8 Methodology Overview</w:t>
+      </w:r>
+    </w:p>
+    <w:p>
+      <w:pPr/>
+      <w:r>
+        <w:t>This project follows an Agile Iterative development methodology, organized into three iterations aligned with FYP semesters: FYP-01 (6th semester) covers requirements gathering, core mobile and web development. FYP-02 (7th semester) covers advanced feature development including push notifications and user study. FYP-03 (8th semester) covers deployment, final testing, and thesis compilation.</w:t>
+      </w:r>
+    </w:p>
+    <w:p>
+      <w:pPr>
+        <w:pStyle w:val="Heading2"/>
+      </w:pPr>
+      <w:r>
+        <w:t>1.9 Report Organization</w:t>
+      </w:r>
+    </w:p>
+    <w:p>
+      <w:pPr/>
+      <w:r>
+        <w:t>This report is organized into eight chapters following the university FYP template: Chapter 1 introduces the project context, problem statement, and objectives. Chapter 2 reviews existing literature and identifies research gaps. Chapter 3 presents the planning methodology and work schedule. Chapter 4 specifies functional and non-functional requirements with use cases. Chapter 5 describes the system design with UML diagrams. Chapter 6 presents the major code implementations. Chapter 7 covers software testing with test cases. Chapter 8 provides the conclusion, limitations, and future work.</w:t>
+      </w:r>
+    </w:p>
+    <w:p>
+      <w:pPr>
+        <w:pStyle w:val="Heading2"/>
+      </w:pPr>
+      <w:r>
+        <w:t>1.10 Chapter Summary</w:t>
+      </w:r>
+    </w:p>
+    <w:p>
+      <w:pPr/>
+      <w:r>
+        <w:t>This chapter introduced the HRAS NGO management ecosystem, establishing the context of NGO digitization challenges in Pakistan. Eight specific objectives were defined, the project scope was delineated, and an Agile Iterative methodology was selected for the 1.5-year development timeline.</w:t>
+      </w:r>
+    </w:p>
+    <w:p>
+      <w:r>
+        <w:br w:type="page"/>
+      </w:r>
+    </w:p>
+    <w:p/>
+    <w:p/>
+    <w:p/>
+    <w:p/>
+    <w:p/>
+    <w:p/>
+    <w:p>
+      <w:pPr>
+        <w:jc w:val="center"/>
+      </w:pPr>
+      <w:r>
+        <w:rPr>
+          <w:rFonts w:ascii="Times New Roman" w:hAnsi="Times New Roman"/>
+          <w:b/>
+          <w:sz w:val="44"/>
+        </w:rPr>
+        <w:t>Chapter 2</w:t>
+      </w:r>
+    </w:p>
+    <w:p>
+      <w:pPr>
+        <w:jc w:val="center"/>
+      </w:pPr>
+      <w:r>
+        <w:rPr>
+          <w:rFonts w:ascii="Times New Roman" w:hAnsi="Times New Roman"/>
+          <w:b/>
+          <w:sz w:val="40"/>
+        </w:rPr>
+        <w:t>Literature Review</w:t>
+      </w:r>
+    </w:p>
+    <w:p>
+      <w:r>
+        <w:br w:type="page"/>
       </w:r>
     </w:p>
     <w:p>
@@ -522,358 +1087,9 @@
         <w:jc w:val="center"/>
       </w:pPr>
       <w:r>
-        <w:t>INTRODUCTION</w:t>
-      </w:r>
-    </w:p>
-    <w:p/>
-    <w:p>
-      <w:pPr>
-        <w:pStyle w:val="Heading2"/>
-      </w:pPr>
-      <w:r>
-        <w:t>1.1 Background and Context</w:t>
-      </w:r>
-    </w:p>
-    <w:p>
-      <w:pPr/>
-      <w:r>
-        <w:t>Non-Governmental Organizations (NGOs) play a critical role in addressing social challenges in developing countries, particularly in Pakistan, where millions of families depend on charitable assistance for basic needs such as food, healthcare, and education. According to the Pakistan Centre for Philanthropy, Pakistan's individual giving exceeds PKR 300 billion annually [3], yet the majority of NGO operations remain dependent on informal coordination methods including WhatsApp groups, paper-based registers, and manual record-keeping.</w:t>
-      </w:r>
-    </w:p>
-    <w:p>
-      <w:pPr/>
-      <w:r>
-        <w:t>HRAS (Hamesha Rahein Apke Saath), meaning "Always With You," is a registered NGO operating in Pakistan that conducts campaigns across multiple categories including ration distribution, winter drives, medical aid, education support, orphanage visits, and marriage support. Despite its active community presence, HRAS faces operational challenges common to small and medium-sized NGOs: lack of structured donor tracking, inefficient volunteer coordination, absence of real-time campaign analytics, and limited transparency in fund utilization.</w:t>
-      </w:r>
-    </w:p>
-    <w:p>
-      <w:pPr>
-        <w:pStyle w:val="Heading2"/>
-      </w:pPr>
-      <w:r>
-        <w:t>1.2 Problem Domain</w:t>
-      </w:r>
-    </w:p>
-    <w:p>
-      <w:pPr/>
-      <w:r>
-        <w:t>The problem domain encompasses three interconnected areas of NGO operations:</w:t>
-      </w:r>
-    </w:p>
-    <w:p>
-      <w:pPr/>
-      <w:r>
-        <w:t>Donation Management: Most NGOs in Pakistan lack systematic tracking of monetary and in-kind donations. Donors have no visibility into how their contributions are utilized, which reduces trust and repeat giving [10].</w:t>
-      </w:r>
-    </w:p>
-    <w:p>
-      <w:pPr/>
-      <w:r>
-        <w:t>Volunteer Coordination: Volunteer recruitment and management is typically handled through social media and word-of-mouth. There is no structured mechanism for volunteers to discover campaigns or track their contributions [9].</w:t>
-      </w:r>
-    </w:p>
-    <w:p>
-      <w:pPr/>
-      <w:r>
-        <w:t>Campaign Operations: Campaign planning, execution, and impact measurement are conducted through disconnected tools, making it difficult to assess campaign effectiveness or demonstrate impact to stakeholders.</w:t>
-      </w:r>
-    </w:p>
-    <w:p>
-      <w:pPr>
-        <w:pStyle w:val="Heading2"/>
-      </w:pPr>
-      <w:r>
-        <w:t>1.3 Motivation</w:t>
-      </w:r>
-    </w:p>
-    <w:p>
-      <w:pPr/>
-      <w:r>
-        <w:t>The motivation for this project stems from direct engagement with the HRAS NGO leadership and volunteers, who articulated specific operational pain points including inability to generate accurate donation reports, difficulty in tracking volunteer participation, no centralized campaign management system, lack of transparency, and time-consuming manual processes that divert attention from humanitarian work.</w:t>
-      </w:r>
-    </w:p>
-    <w:p>
-      <w:pPr>
-        <w:pStyle w:val="Heading2"/>
-      </w:pPr>
-      <w:r>
-        <w:t>1.4 Problem Statement</w:t>
-      </w:r>
-    </w:p>
-    <w:p>
-      <w:pPr/>
-      <w:r>
-        <w:t>Small and medium-sized NGOs in Pakistan lack an integrated, affordable digital platform that unifies campaign management, donation tracking, volunteer coordination, and impact analytics across mobile and web platforms, resulting in operational inefficiency, reduced donor trust, and limited scalability of humanitarian impact.</w:t>
-      </w:r>
-    </w:p>
-    <w:p>
-      <w:pPr>
-        <w:pStyle w:val="Heading2"/>
-      </w:pPr>
-      <w:r>
-        <w:t>1.5 Project Objectives</w:t>
-      </w:r>
-    </w:p>
-    <w:p>
-      <w:pPr/>
-      <w:r>
-        <w:t>1. To design and develop a cross-platform NGO management ecosystem using Flutter and Firebase that operates on Android, iOS, and Web from a single codebase.</w:t>
-      </w:r>
-    </w:p>
-    <w:p>
-      <w:pPr/>
-      <w:r>
-        <w:t>2. To implement a comprehensive campaign management module supporting the full lifecycle from creation to completion with real-time status tracking.</w:t>
-      </w:r>
-    </w:p>
-    <w:p>
-      <w:pPr/>
-      <w:r>
-        <w:t>3. To build a donation tracking system that records monetary and in-kind contributions with PDF receipt generation for transparency.</w:t>
-      </w:r>
-    </w:p>
-    <w:p>
-      <w:pPr/>
-      <w:r>
-        <w:t>4. To develop a volunteer management module enabling self-registration, campaign participation tracking, and contribution history.</w:t>
-      </w:r>
-    </w:p>
-    <w:p>
-      <w:pPr/>
-      <w:r>
-        <w:t>5. To implement role-based access control (RBAC) ensuring administrative functions are secured through server-side security rules.</w:t>
-      </w:r>
-    </w:p>
-    <w:p>
-      <w:pPr/>
-      <w:r>
-        <w:t>6. To create a responsive admin dashboard providing real-time analytics, user management, and PDF report generation.</w:t>
-      </w:r>
-    </w:p>
-    <w:p>
-      <w:pPr/>
-      <w:r>
-        <w:t>7. To design and implement a unified design system ensuring visual consistency across all platforms.</w:t>
-      </w:r>
-    </w:p>
-    <w:p>
-      <w:pPr/>
-      <w:r>
-        <w:t>8. To evaluate the system through unit testing, user feedback, and comparative analysis with existing solutions.</w:t>
-      </w:r>
-    </w:p>
-    <w:p>
-      <w:pPr>
-        <w:pStyle w:val="Heading2"/>
-      </w:pPr>
-      <w:r>
-        <w:t>1.6 Scope of the Project</w:t>
-      </w:r>
-    </w:p>
-    <w:p>
-      <w:pPr>
-        <w:pStyle w:val="Heading3"/>
-      </w:pPr>
-      <w:r>
-        <w:t>1.6.1 In Scope</w:t>
-      </w:r>
-    </w:p>
-    <w:p>
-      <w:pPr/>
-      <w:r>
-        <w:t>• Mobile application for Android and iOS platforms</w:t>
-      </w:r>
-    </w:p>
-    <w:p>
-      <w:pPr/>
-      <w:r>
-        <w:t>• Web platform with public landing page and authenticated dashboard</w:t>
-      </w:r>
-    </w:p>
-    <w:p>
-      <w:pPr/>
-      <w:r>
-        <w:t>• Admin dashboard with campaign, donation, volunteer, and user management</w:t>
-      </w:r>
-    </w:p>
-    <w:p>
-      <w:pPr/>
-      <w:r>
-        <w:t>• Firebase backend with Firestore, Authentication, and Storage</w:t>
-      </w:r>
-    </w:p>
-    <w:p>
-      <w:pPr/>
-      <w:r>
-        <w:t>• Role-based access control (Admin and Volunteer roles)</w:t>
-      </w:r>
-    </w:p>
-    <w:p>
-      <w:pPr/>
-      <w:r>
-        <w:t>• Real-time data synchronization across platforms</w:t>
-      </w:r>
-    </w:p>
-    <w:p>
-      <w:pPr/>
-      <w:r>
-        <w:t>• PDF generation for donation receipts and analytics reports</w:t>
-      </w:r>
-    </w:p>
-    <w:p>
-      <w:pPr/>
-      <w:r>
-        <w:t>• Dark and light theme support with responsive design</w:t>
-      </w:r>
-    </w:p>
-    <w:p>
-      <w:pPr>
-        <w:pStyle w:val="Heading3"/>
-      </w:pPr>
-      <w:r>
-        <w:t>1.6.2 Out of Scope</w:t>
-      </w:r>
-    </w:p>
-    <w:p>
-      <w:pPr/>
-      <w:r>
-        <w:t>• Online payment gateway integration (JazzCash, Easypaisa)</w:t>
-      </w:r>
-    </w:p>
-    <w:p>
-      <w:pPr/>
-      <w:r>
-        <w:t>• SMS-based notifications</w:t>
-      </w:r>
-    </w:p>
-    <w:p>
-      <w:pPr/>
-      <w:r>
-        <w:t>• Multi-organization (SaaS) support</w:t>
-      </w:r>
-    </w:p>
-    <w:p>
-      <w:pPr/>
-      <w:r>
-        <w:t>• Blockchain-based donation verification</w:t>
-      </w:r>
-    </w:p>
-    <w:p>
-      <w:pPr>
-        <w:pStyle w:val="Heading2"/>
-      </w:pPr>
-      <w:r>
-        <w:t>1.7 Limitations</w:t>
-      </w:r>
-    </w:p>
-    <w:p>
-      <w:pPr/>
-      <w:r>
-        <w:t>1. The system requires internet connectivity for full functionality.</w:t>
-      </w:r>
-    </w:p>
-    <w:p>
-      <w:pPr/>
-      <w:r>
-        <w:t>2. The application does not process real financial transactions; donation recording is manual entry by administrators.</w:t>
-      </w:r>
-    </w:p>
-    <w:p>
-      <w:pPr/>
-      <w:r>
-        <w:t>3. The system is designed for a single organization (HRAS); multi-tenant architecture is not implemented.</w:t>
-      </w:r>
-    </w:p>
-    <w:p>
-      <w:pPr/>
-      <w:r>
-        <w:t>4. Performance testing is limited to emulator and development environments.</w:t>
-      </w:r>
-    </w:p>
-    <w:p>
-      <w:pPr/>
-      <w:r>
-        <w:t>5. Real-time push notifications are not yet implemented; they are planned for FYP-02 using Firebase Cloud Messaging (FCM).</w:t>
-      </w:r>
-    </w:p>
-    <w:p>
-      <w:pPr/>
-      <w:r>
-        <w:t>6. The current system does not include an intelligent volunteer-campaign matching algorithm; this is planned as an innovation feature for FYP-02.</w:t>
-      </w:r>
-    </w:p>
-    <w:p>
-      <w:pPr/>
-      <w:r>
-        <w:t>7. Comprehensive user acceptance testing (UAT) with real HRAS volunteers has not yet been conducted; a formal user study is planned for FYP-02.</w:t>
-      </w:r>
-    </w:p>
-    <w:p>
-      <w:pPr>
-        <w:pStyle w:val="Heading2"/>
-      </w:pPr>
-      <w:r>
-        <w:t>1.8 Methodology Overview</w:t>
-      </w:r>
-    </w:p>
-    <w:p>
-      <w:pPr/>
-      <w:r>
-        <w:t>This project follows an Agile Iterative development methodology, organized into three iterations aligned with FYP semesters: FYP-01 (6th semester) covers requirements gathering, core mobile and web development. FYP-02 (7th semester) covers advanced feature development including push notifications and user study. FYP-03 (8th semester) covers deployment, final testing, and thesis compilation.</w:t>
-      </w:r>
-    </w:p>
-    <w:p>
-      <w:pPr>
-        <w:pStyle w:val="Heading2"/>
-      </w:pPr>
-      <w:r>
-        <w:t>1.9 Report Organization</w:t>
-      </w:r>
-    </w:p>
-    <w:p>
-      <w:pPr/>
-      <w:r>
-        <w:t>This report is organized into eight chapters following the university FYP template: Chapter 1 introduces the project context, problem statement, and objectives. Chapter 2 reviews existing literature and identifies research gaps. Chapter 3 presents the planning methodology and work schedule. Chapter 4 specifies functional and non-functional requirements with use cases. Chapter 5 describes the system design with UML diagrams. Chapter 6 presents the major code implementations. Chapter 7 covers software testing with test cases. Chapter 8 provides the conclusion, limitations, and future work.</w:t>
-      </w:r>
-    </w:p>
-    <w:p>
-      <w:pPr>
-        <w:pStyle w:val="Heading2"/>
-      </w:pPr>
-      <w:r>
-        <w:t>1.10 Chapter Summary</w:t>
-      </w:r>
-    </w:p>
-    <w:p>
-      <w:pPr/>
-      <w:r>
-        <w:t>This chapter introduced the HRAS NGO management ecosystem, establishing the context of NGO digitization challenges in Pakistan. Eight specific objectives were defined, the project scope was delineated, and an Agile Iterative methodology was selected for the 1.5-year development timeline.</w:t>
-      </w:r>
-    </w:p>
-    <w:p>
-      <w:r>
-        <w:br w:type="page"/>
-      </w:r>
-    </w:p>
-    <w:p>
-      <w:pPr>
-        <w:pStyle w:val="Heading1"/>
-        <w:jc w:val="center"/>
-      </w:pPr>
-      <w:r>
-        <w:t>CHAPTER 2</w:t>
-      </w:r>
-    </w:p>
-    <w:p>
-      <w:pPr>
-        <w:pStyle w:val="Heading1"/>
-        <w:jc w:val="center"/>
-      </w:pPr>
-      <w:r>
-        <w:t>LITERATURE REVIEW</w:t>
-      </w:r>
-    </w:p>
-    <w:p/>
+        <w:t>Chapter 2: Literature Review</w:t>
+      </w:r>
+    </w:p>
     <w:p>
       <w:pPr>
         <w:pStyle w:val="Heading2"/>
@@ -2611,6 +2827,37 @@
     </w:sectPr>
     <w:p>
       <w:pPr>
+        <w:jc w:val="center"/>
+      </w:pPr>
+      <w:r>
+        <w:rPr>
+          <w:rFonts w:ascii="Times New Roman" w:hAnsi="Times New Roman"/>
+          <w:b/>
+          <w:sz w:val="44"/>
+        </w:rPr>
+        <w:t>Chapter 3</w:t>
+      </w:r>
+    </w:p>
+    <w:p>
+      <w:pPr>
+        <w:jc w:val="center"/>
+      </w:pPr>
+      <w:r>
+        <w:rPr>
+          <w:rFonts w:ascii="Times New Roman" w:hAnsi="Times New Roman"/>
+          <w:b/>
+          <w:sz w:val="40"/>
+        </w:rPr>
+        <w:t>Planning and Methodology</w:t>
+      </w:r>
+    </w:p>
+    <w:p>
+      <w:r>
+        <w:br w:type="page"/>
+      </w:r>
+    </w:p>
+    <w:p>
+      <w:pPr>
         <w:pStyle w:val="Heading1"/>
         <w:jc w:val="center"/>
       </w:pPr>
@@ -3549,6 +3796,43 @@
         <w:br w:type="page"/>
       </w:r>
     </w:p>
+    <w:p/>
+    <w:p/>
+    <w:p/>
+    <w:p/>
+    <w:p/>
+    <w:p/>
+    <w:p>
+      <w:pPr>
+        <w:jc w:val="center"/>
+      </w:pPr>
+      <w:r>
+        <w:rPr>
+          <w:rFonts w:ascii="Times New Roman" w:hAnsi="Times New Roman"/>
+          <w:b/>
+          <w:sz w:val="44"/>
+        </w:rPr>
+        <w:t>Chapter 4</w:t>
+      </w:r>
+    </w:p>
+    <w:p>
+      <w:pPr>
+        <w:jc w:val="center"/>
+      </w:pPr>
+      <w:r>
+        <w:rPr>
+          <w:rFonts w:ascii="Times New Roman" w:hAnsi="Times New Roman"/>
+          <w:b/>
+          <w:sz w:val="40"/>
+        </w:rPr>
+        <w:t>System Specification</w:t>
+      </w:r>
+    </w:p>
+    <w:p>
+      <w:r>
+        <w:br w:type="page"/>
+      </w:r>
+    </w:p>
     <w:p>
       <w:pPr>
         <w:pStyle w:val="Heading1"/>
@@ -6232,6 +6516,43 @@
         <w:br w:type="page"/>
       </w:r>
     </w:p>
+    <w:p/>
+    <w:p/>
+    <w:p/>
+    <w:p/>
+    <w:p/>
+    <w:p/>
+    <w:p>
+      <w:pPr>
+        <w:jc w:val="center"/>
+      </w:pPr>
+      <w:r>
+        <w:rPr>
+          <w:rFonts w:ascii="Times New Roman" w:hAnsi="Times New Roman"/>
+          <w:b/>
+          <w:sz w:val="44"/>
+        </w:rPr>
+        <w:t>Chapter 5</w:t>
+      </w:r>
+    </w:p>
+    <w:p>
+      <w:pPr>
+        <w:jc w:val="center"/>
+      </w:pPr>
+      <w:r>
+        <w:rPr>
+          <w:rFonts w:ascii="Times New Roman" w:hAnsi="Times New Roman"/>
+          <w:b/>
+          <w:sz w:val="40"/>
+        </w:rPr>
+        <w:t>System Design</w:t>
+      </w:r>
+    </w:p>
+    <w:p>
+      <w:r>
+        <w:br w:type="page"/>
+      </w:r>
+    </w:p>
     <w:p>
       <w:pPr>
         <w:pStyle w:val="Heading1"/>
@@ -8202,6 +8523,43 @@
         <w:br w:type="page"/>
       </w:r>
     </w:p>
+    <w:p/>
+    <w:p/>
+    <w:p/>
+    <w:p/>
+    <w:p/>
+    <w:p/>
+    <w:p>
+      <w:pPr>
+        <w:jc w:val="center"/>
+      </w:pPr>
+      <w:r>
+        <w:rPr>
+          <w:rFonts w:ascii="Times New Roman" w:hAnsi="Times New Roman"/>
+          <w:b/>
+          <w:sz w:val="44"/>
+        </w:rPr>
+        <w:t>Chapter 6</w:t>
+      </w:r>
+    </w:p>
+    <w:p>
+      <w:pPr>
+        <w:jc w:val="center"/>
+      </w:pPr>
+      <w:r>
+        <w:rPr>
+          <w:rFonts w:ascii="Times New Roman" w:hAnsi="Times New Roman"/>
+          <w:b/>
+          <w:sz w:val="40"/>
+        </w:rPr>
+        <w:t>Coding</w:t>
+      </w:r>
+    </w:p>
+    <w:p>
+      <w:r>
+        <w:br w:type="page"/>
+      </w:r>
+    </w:p>
     <w:p>
       <w:pPr>
         <w:pStyle w:val="Heading1"/>
@@ -8473,6 +8831,37 @@
     </w:p>
     <w:p>
       <w:pPr>
+        <w:jc w:val="center"/>
+      </w:pPr>
+      <w:r>
+        <w:rPr>
+          <w:rFonts w:ascii="Times New Roman" w:hAnsi="Times New Roman"/>
+          <w:b/>
+          <w:sz w:val="44"/>
+        </w:rPr>
+        <w:t>Chapter 7</w:t>
+      </w:r>
+    </w:p>
+    <w:p>
+      <w:pPr>
+        <w:jc w:val="center"/>
+      </w:pPr>
+      <w:r>
+        <w:rPr>
+          <w:rFonts w:ascii="Times New Roman" w:hAnsi="Times New Roman"/>
+          <w:b/>
+          <w:sz w:val="40"/>
+        </w:rPr>
+        <w:t>Software Testing</w:t>
+      </w:r>
+    </w:p>
+    <w:p>
+      <w:r>
+        <w:br w:type="page"/>
+      </w:r>
+    </w:p>
+    <w:p>
+      <w:pPr>
         <w:pStyle w:val="Heading1"/>
         <w:jc w:val="center"/>
       </w:pPr>
@@ -10218,6 +10607,43 @@
       <w:pPr/>
       <w:r>
         <w:t>All 62 automated unit tests pass with 100% success rate. Manual black box testing confirmed that all 15 functional requirements meet their specifications. The QR attendance and smart matching features (FYP-02) function correctly under test conditions.</w:t>
+      </w:r>
+    </w:p>
+    <w:p>
+      <w:r>
+        <w:br w:type="page"/>
+      </w:r>
+    </w:p>
+    <w:p/>
+    <w:p/>
+    <w:p/>
+    <w:p/>
+    <w:p/>
+    <w:p/>
+    <w:p>
+      <w:pPr>
+        <w:jc w:val="center"/>
+      </w:pPr>
+      <w:r>
+        <w:rPr>
+          <w:rFonts w:ascii="Times New Roman" w:hAnsi="Times New Roman"/>
+          <w:b/>
+          <w:sz w:val="44"/>
+        </w:rPr>
+        <w:t>Chapter 8</w:t>
+      </w:r>
+    </w:p>
+    <w:p>
+      <w:pPr>
+        <w:jc w:val="center"/>
+      </w:pPr>
+      <w:r>
+        <w:rPr>
+          <w:rFonts w:ascii="Times New Roman" w:hAnsi="Times New Roman"/>
+          <w:b/>
+          <w:sz w:val="40"/>
+        </w:rPr>
+        <w:t>Conclusion</w:t>
       </w:r>
     </w:p>
     <w:p>

</xml_diff>